<commit_message>
peer-review-fiks: punkt 7, 8 og 9
- Fjernet Pangaribuan (2025) og Tan & Yeh (2021) fra bibliografien (ikke sitert)
- Kap. 6.1: spelt ut "Capacitated" i CVRPTW ved første bruk
- Kap. 1.2/1.3: fjernet overlapp mellom avgrensinger og antagelser

Co-Authored-By: Claude Opus 4.7 (1M context) <noreply@anthropic.com>
</commit_message>
<xml_diff>
--- a/014 fase 4 - report/rapport.docx
+++ b/014 fase 4 - report/rapport.docx
@@ -5365,7 +5365,7 @@
         <w:rPr>
           <w:lang w:val="nb-NO"/>
         </w:rPr>
-        <w:t>For det andre fokuserer oppgaven på et statisk ruteplanleggingsproblem. Det innebærer at alle data, som etterspørsel, avstander og tidsvinduer antas å forholde seg uendret over tid. Dynamiske forhold som trafikk, vær eller uforutsette hendelser er ikke inkludert. Dette er gjort for å kunne analysere problemet innenfor VRP-ramme.</w:t>
+        <w:t>For det andre fokuserer oppgaven på et statisk ruteplanleggingsproblem. Det innebærer at planleggingen gjøres én gang ut fra kjente inputdata, uten sanntidsoppdatering eller reoptimalisering underveis i et oppdrag. Dette er gjort for å kunne analysere problemet innenfor VRP-rammen.</w:t>
       </w:r>
     </w:p>
     <w:p>
@@ -5492,35 +5492,21 @@
         <w:rPr>
           <w:lang w:val="nb-NO"/>
         </w:rPr>
-        <w:t xml:space="preserve">For å gjøre ruteplanleggingsproblemet håndterbart er det gjort flere forenklede antakelser. </w:t>
-      </w:r>
-      <w:r>
-        <w:t xml:space="preserve">Vi </w:t>
-      </w:r>
+        <w:t>Avgrensingene over beskriver hva som er valgt inn og ut av modellen. I tillegg er det gjort flere forenklede antagelser om forhold som faktisk inngår i modellen, men som er representert på en forenklet måte. Vi erkjenner at dette påvirker hvor realistiske resultatene blir.</w:t>
+      </w:r>
+      <w:r/>
       <w:proofErr w:type="spellStart"/>
-      <w:r>
-        <w:t>erkjenner</w:t>
-      </w:r>
+      <w:r/>
       <w:proofErr w:type="spellEnd"/>
-      <w:r>
-        <w:t xml:space="preserve"> at </w:t>
-      </w:r>
+      <w:r/>
       <w:proofErr w:type="spellStart"/>
-      <w:r>
-        <w:t>dette</w:t>
-      </w:r>
+      <w:r/>
       <w:proofErr w:type="spellEnd"/>
-      <w:r>
-        <w:t xml:space="preserve"> </w:t>
-      </w:r>
+      <w:r/>
       <w:proofErr w:type="spellStart"/>
-      <w:r>
-        <w:t>påvirker</w:t>
-      </w:r>
+      <w:r/>
       <w:proofErr w:type="spellEnd"/>
-      <w:r>
-        <w:t xml:space="preserve"> hvor realistiske resultatene blir.</w:t>
-      </w:r>
+      <w:r/>
     </w:p>
     <w:p>
       <w:pPr>
@@ -5578,37 +5564,6 @@
           <w:lang w:val="nb-NO"/>
         </w:rPr>
         <w:t>Det forutsettes at alle data er deterministiske og kjente på forhånd. Etterspørsel, tidsvinduer og lastetider er dermed faste vinduer uten usikkerhet. I en virkelig verden endrer slike parameter seg kontinuerlig, noe som betyr at modellen ikke kommer til å vise operasjonell usikkerhet.</w:t>
-      </w:r>
-    </w:p>
-    <w:p>
-      <w:pPr>
-        <w:numPr>
-          <w:ilvl w:val="0"/>
-          <w:numId w:val="3"/>
-        </w:numPr>
-        <w:rPr>
-          <w:lang w:val="nb-NO"/>
-        </w:rPr>
-      </w:pPr>
-      <w:r>
-        <w:rPr>
-          <w:lang w:val="nb-NO"/>
-        </w:rPr>
-        <w:t xml:space="preserve">Det antas at kjøretøyets kapasitet er fast og kjent, og at denne ikke kan </w:t>
-      </w:r>
-      <w:proofErr w:type="spellStart"/>
-      <w:r>
-        <w:rPr>
-          <w:lang w:val="nb-NO"/>
-        </w:rPr>
-        <w:t>overskrides</w:t>
-      </w:r>
-      <w:proofErr w:type="spellEnd"/>
-      <w:r>
-        <w:rPr>
-          <w:lang w:val="nb-NO"/>
-        </w:rPr>
-        <w:t>. Det betyr at de konstruerte rutene må forholde seg til denne begrensningen.</w:t>
       </w:r>
     </w:p>
     <w:p>
@@ -8918,7 +8873,7 @@
         <w:rPr>
           <w:lang w:val="nb-NO"/>
         </w:rPr>
-        <w:t xml:space="preserve">Modellen formuleres som et kapasitets- og tidsbegrenset </w:t>
+        <w:t xml:space="preserve">Modellen formuleres som et Capacitated </w:t>
       </w:r>
       <w:proofErr w:type="spellStart"/>
       <w:r>
@@ -8946,7 +8901,7 @@
         <w:rPr>
           <w:lang w:val="nb-NO"/>
         </w:rPr>
-        <w:t xml:space="preserve"> Time Windows (CVRPTW), basert på klassisk formulering i </w:t>
+        <w:t xml:space="preserve"> Time Windows (CVRPTW), altså et kapasitets- og tidsbegrenset VRPTW, basert på klassisk formulering i </w:t>
       </w:r>
       <w:proofErr w:type="spellStart"/>
       <w:r>
@@ -15398,19 +15353,19 @@
     <w:p>
       <w:pPr>
         <w:pStyle w:val="BodyText"/>
+      </w:pPr>
+      <w:r>
         <w:rPr>
           <w:lang w:val="fr-FR"/>
         </w:rPr>
-      </w:pPr>
-      <w:r>
-        <w:t xml:space="preserve">Pangaribuan, M. A., Hidayati, J., &amp; Nasution, H. (2025). </w:t>
+        <w:t xml:space="preserve">Solomon, M. M. (1987). </w:t>
       </w:r>
       <w:r>
         <w:rPr>
           <w:i/>
           <w:iCs/>
         </w:rPr>
-        <w:t>Literature review on vehicle routing problem: Approaches, algorithms and current challenges</w:t>
+        <w:t>Algorithms for the vehicle routing and scheduling problems with time window constraints</w:t>
       </w:r>
       <w:r>
         <w:t xml:space="preserve">. </w:t>
@@ -15419,92 +15374,11 @@
         <w:rPr>
           <w:i/>
           <w:iCs/>
-          <w:lang w:val="fr-FR"/>
-        </w:rPr>
-        <w:t xml:space="preserve">Journal La </w:t>
-      </w:r>
-      <w:proofErr w:type="spellStart"/>
-      <w:r>
-        <w:rPr>
-          <w:i/>
-          <w:iCs/>
-          <w:lang w:val="fr-FR"/>
-        </w:rPr>
-        <w:t>Multiapp</w:t>
-      </w:r>
-      <w:proofErr w:type="spellEnd"/>
-      <w:r>
-        <w:rPr>
-          <w:i/>
-          <w:iCs/>
-          <w:lang w:val="fr-FR"/>
-        </w:rPr>
-        <w:t>, 6</w:t>
-      </w:r>
-      <w:r>
-        <w:rPr>
-          <w:lang w:val="fr-FR"/>
-        </w:rPr>
-        <w:t>(6), 1397–1409. https://doi.org/10.37899/journallamultiapp.v6i6.2382</w:t>
-      </w:r>
-    </w:p>
-    <w:p>
-      <w:pPr>
-        <w:pStyle w:val="BodyText"/>
-      </w:pPr>
-      <w:r>
-        <w:rPr>
-          <w:lang w:val="fr-FR"/>
-        </w:rPr>
-        <w:t xml:space="preserve">Solomon, M. M. (1987). </w:t>
-      </w:r>
-      <w:r>
-        <w:rPr>
-          <w:i/>
-          <w:iCs/>
-        </w:rPr>
-        <w:t>Algorithms for the vehicle routing and scheduling problems with time window constraints</w:t>
-      </w:r>
-      <w:r>
-        <w:t xml:space="preserve">. </w:t>
-      </w:r>
-      <w:r>
-        <w:rPr>
-          <w:i/>
-          <w:iCs/>
         </w:rPr>
         <w:t>Operations Research, 35</w:t>
       </w:r>
       <w:r>
         <w:t>(2), 254–265. https://doi.org/10.1287/opre.35.2.254</w:t>
-      </w:r>
-    </w:p>
-    <w:p>
-      <w:pPr>
-        <w:pStyle w:val="BodyText"/>
-      </w:pPr>
-      <w:r>
-        <w:t xml:space="preserve">Tan, S.-Y., &amp; Yeh, W.-C. (2021). </w:t>
-      </w:r>
-      <w:r>
-        <w:rPr>
-          <w:i/>
-          <w:iCs/>
-        </w:rPr>
-        <w:t>The vehicle routing problem: State-of-the-art classification and review</w:t>
-      </w:r>
-      <w:r>
-        <w:t xml:space="preserve">. </w:t>
-      </w:r>
-      <w:r>
-        <w:rPr>
-          <w:i/>
-          <w:iCs/>
-        </w:rPr>
-        <w:t>Applied Sciences, 11</w:t>
-      </w:r>
-      <w:r>
-        <w:t>(21), 10295. https://doi.org/10.3390/app112110295</w:t>
       </w:r>
     </w:p>
     <w:p>

</xml_diff>